<commit_message>
update Task50 .docx and add Task50 .md
</commit_message>
<xml_diff>
--- a/docs/Task50-form-validation.docx
+++ b/docs/Task50-form-validation.docx
@@ -1562,156 +1562,6 @@
                 <w:rFonts w:ascii="Arial Unicode MS" w:cs="Arial Unicode MS" w:eastAsia="Arial Unicode MS" w:hAnsi="Arial Unicode MS"/>
                 <w:rtl w:val="0"/>
               </w:rPr>
-              <w:t xml:space="preserve">ผู้สอน</w:t>
-            </w:r>
-          </w:p>
-        </w:tc>
-        <w:tc>
-          <w:tcPr>
-            <w:tcBorders>
-              <w:top w:color="000000" w:space="0" w:sz="8" w:val="single"/>
-              <w:left w:color="000000" w:space="0" w:sz="8" w:val="single"/>
-              <w:bottom w:color="000000" w:space="0" w:sz="8" w:val="single"/>
-              <w:right w:color="000000" w:space="0" w:sz="8" w:val="single"/>
-            </w:tcBorders>
-            <w:tcMar>
-              <w:top w:w="100.0" w:type="dxa"/>
-              <w:left w:w="100.0" w:type="dxa"/>
-              <w:bottom w:w="100.0" w:type="dxa"/>
-              <w:right w:w="100.0" w:type="dxa"/>
-            </w:tcMar>
-            <w:vAlign w:val="top"/>
-          </w:tcPr>
-          <w:p>
-            <w:pPr>
-              <w:rPr/>
-            </w:pPr>
-            <w:r>
-              <w:rPr>
-                <w:rtl w:val="0"/>
-              </w:rPr>
-              <w:t xml:space="preserve">Dropdown</w:t>
-            </w:r>
-          </w:p>
-        </w:tc>
-        <w:tc>
-          <w:tcPr>
-            <w:tcBorders>
-              <w:top w:color="000000" w:space="0" w:sz="8" w:val="single"/>
-              <w:left w:color="000000" w:space="0" w:sz="8" w:val="single"/>
-              <w:bottom w:color="000000" w:space="0" w:sz="8" w:val="single"/>
-              <w:right w:color="000000" w:space="0" w:sz="8" w:val="single"/>
-            </w:tcBorders>
-            <w:tcMar>
-              <w:top w:w="100.0" w:type="dxa"/>
-              <w:left w:w="100.0" w:type="dxa"/>
-              <w:bottom w:w="100.0" w:type="dxa"/>
-              <w:right w:w="100.0" w:type="dxa"/>
-            </w:tcMar>
-            <w:vAlign w:val="top"/>
-          </w:tcPr>
-          <w:p>
-            <w:pPr>
-              <w:rPr/>
-            </w:pPr>
-            <w:r>
-              <w:rPr>
-                <w:rFonts w:ascii="Arial Unicode MS" w:cs="Arial Unicode MS" w:eastAsia="Arial Unicode MS" w:hAnsi="Arial Unicode MS"/>
-                <w:rtl w:val="0"/>
-              </w:rPr>
-              <w:t xml:space="preserve">เสริม</w:t>
-            </w:r>
-          </w:p>
-        </w:tc>
-        <w:tc>
-          <w:tcPr>
-            <w:tcBorders>
-              <w:top w:color="000000" w:space="0" w:sz="8" w:val="single"/>
-              <w:left w:color="000000" w:space="0" w:sz="8" w:val="single"/>
-              <w:bottom w:color="000000" w:space="0" w:sz="8" w:val="single"/>
-              <w:right w:color="000000" w:space="0" w:sz="8" w:val="single"/>
-            </w:tcBorders>
-            <w:tcMar>
-              <w:top w:w="100.0" w:type="dxa"/>
-              <w:left w:w="100.0" w:type="dxa"/>
-              <w:bottom w:w="100.0" w:type="dxa"/>
-              <w:right w:w="100.0" w:type="dxa"/>
-            </w:tcMar>
-            <w:vAlign w:val="top"/>
-          </w:tcPr>
-          <w:p>
-            <w:pPr>
-              <w:rPr/>
-            </w:pPr>
-            <w:r>
-              <w:rPr>
-                <w:rFonts w:ascii="Arial Unicode MS" w:cs="Arial Unicode MS" w:eastAsia="Arial Unicode MS" w:hAnsi="Arial Unicode MS"/>
-                <w:rtl w:val="0"/>
-              </w:rPr>
-              <w:t xml:space="preserve">เลือกผู้สอนจากข้อมูลที่ระบบรองรับ หรือไม่ระบุ</w:t>
-            </w:r>
-          </w:p>
-        </w:tc>
-      </w:tr>
-      <w:tr>
-        <w:trPr>
-          <w:cantSplit w:val="0"/>
-          <w:trHeight w:val="830" w:hRule="atLeast"/>
-          <w:tblHeader w:val="0"/>
-        </w:trPr>
-        <w:tc>
-          <w:tcPr>
-            <w:tcBorders>
-              <w:top w:color="000000" w:space="0" w:sz="8" w:val="single"/>
-              <w:left w:color="000000" w:space="0" w:sz="8" w:val="single"/>
-              <w:bottom w:color="000000" w:space="0" w:sz="8" w:val="single"/>
-              <w:right w:color="000000" w:space="0" w:sz="8" w:val="single"/>
-            </w:tcBorders>
-            <w:tcMar>
-              <w:top w:w="100.0" w:type="dxa"/>
-              <w:left w:w="100.0" w:type="dxa"/>
-              <w:bottom w:w="100.0" w:type="dxa"/>
-              <w:right w:w="100.0" w:type="dxa"/>
-            </w:tcMar>
-            <w:vAlign w:val="top"/>
-          </w:tcPr>
-          <w:p>
-            <w:pPr>
-              <w:rPr/>
-            </w:pPr>
-            <w:r>
-              <w:rPr>
-                <w:rtl w:val="0"/>
-              </w:rPr>
-              <w:t xml:space="preserve">10</w:t>
-            </w:r>
-          </w:p>
-        </w:tc>
-        <w:tc>
-          <w:tcPr>
-            <w:tcBorders>
-              <w:top w:color="000000" w:space="0" w:sz="8" w:val="single"/>
-              <w:left w:color="000000" w:space="0" w:sz="8" w:val="single"/>
-              <w:bottom w:color="000000" w:space="0" w:sz="8" w:val="single"/>
-              <w:right w:color="000000" w:space="0" w:sz="8" w:val="single"/>
-            </w:tcBorders>
-            <w:tcMar>
-              <w:top w:w="100.0" w:type="dxa"/>
-              <w:left w:w="100.0" w:type="dxa"/>
-              <w:bottom w:w="100.0" w:type="dxa"/>
-              <w:right w:w="100.0" w:type="dxa"/>
-            </w:tcMar>
-            <w:vAlign w:val="top"/>
-          </w:tcPr>
-          <w:p>
-            <w:pPr>
-              <w:rPr/>
-            </w:pPr>
-            <w:r>
-              <w:rPr>
-                <w:rFonts w:ascii="Arial Unicode MS" w:cs="Arial Unicode MS" w:eastAsia="Arial Unicode MS" w:hAnsi="Arial Unicode MS"/>
-                <w:rtl w:val="0"/>
-              </w:rPr>
               <w:t xml:space="preserve">คำแนะนำในการเตรียมสอบ</w:t>
             </w:r>
           </w:p>
@@ -1845,7 +1695,7 @@
     <w:tbl>
       <w:tblPr>
         <w:tblStyle w:val="Table2"/>
-        <w:tblW w:w="5905.0" w:type="dxa"/>
+        <w:tblW w:w="5880.0" w:type="dxa"/>
         <w:jc w:val="left"/>
         <w:tblBorders>
           <w:top w:color="000000" w:space="0" w:sz="0" w:val="nil"/>
@@ -1859,12 +1709,12 @@
         <w:tblLook w:val="0600"/>
       </w:tblPr>
       <w:tblGrid>
-        <w:gridCol w:w="1655"/>
-        <w:gridCol w:w="4250"/>
+        <w:gridCol w:w="1650"/>
+        <w:gridCol w:w="4230"/>
         <w:tblGridChange w:id="0">
           <w:tblGrid>
-            <w:gridCol w:w="1655"/>
-            <w:gridCol w:w="4250"/>
+            <w:gridCol w:w="1650"/>
+            <w:gridCol w:w="4230"/>
           </w:tblGrid>
         </w:tblGridChange>
       </w:tblGrid>
@@ -2339,71 +2189,6 @@
           </w:p>
         </w:tc>
       </w:tr>
-      <w:tr>
-        <w:trPr>
-          <w:cantSplit w:val="0"/>
-          <w:trHeight w:val="530" w:hRule="atLeast"/>
-          <w:tblHeader w:val="0"/>
-        </w:trPr>
-        <w:tc>
-          <w:tcPr>
-            <w:tcBorders>
-              <w:top w:color="000000" w:space="0" w:sz="8" w:val="single"/>
-              <w:left w:color="000000" w:space="0" w:sz="8" w:val="single"/>
-              <w:bottom w:color="000000" w:space="0" w:sz="8" w:val="single"/>
-              <w:right w:color="000000" w:space="0" w:sz="8" w:val="single"/>
-            </w:tcBorders>
-            <w:tcMar>
-              <w:top w:w="100.0" w:type="dxa"/>
-              <w:left w:w="100.0" w:type="dxa"/>
-              <w:bottom w:w="100.0" w:type="dxa"/>
-              <w:right w:w="100.0" w:type="dxa"/>
-            </w:tcMar>
-            <w:vAlign w:val="top"/>
-          </w:tcPr>
-          <w:p>
-            <w:pPr>
-              <w:rPr/>
-            </w:pPr>
-            <w:r>
-              <w:rPr>
-                <w:rFonts w:ascii="Arial Unicode MS" w:cs="Arial Unicode MS" w:eastAsia="Arial Unicode MS" w:hAnsi="Arial Unicode MS"/>
-                <w:rtl w:val="0"/>
-              </w:rPr>
-              <w:t xml:space="preserve">ผู้สอน</w:t>
-            </w:r>
-          </w:p>
-        </w:tc>
-        <w:tc>
-          <w:tcPr>
-            <w:tcBorders>
-              <w:top w:color="000000" w:space="0" w:sz="8" w:val="single"/>
-              <w:left w:color="000000" w:space="0" w:sz="8" w:val="single"/>
-              <w:bottom w:color="000000" w:space="0" w:sz="8" w:val="single"/>
-              <w:right w:color="000000" w:space="0" w:sz="8" w:val="single"/>
-            </w:tcBorders>
-            <w:tcMar>
-              <w:top w:w="100.0" w:type="dxa"/>
-              <w:left w:w="100.0" w:type="dxa"/>
-              <w:bottom w:w="100.0" w:type="dxa"/>
-              <w:right w:w="100.0" w:type="dxa"/>
-            </w:tcMar>
-            <w:vAlign w:val="top"/>
-          </w:tcPr>
-          <w:p>
-            <w:pPr>
-              <w:rPr/>
-            </w:pPr>
-            <w:r>
-              <w:rPr>
-                <w:rFonts w:ascii="Arial Unicode MS" w:cs="Arial Unicode MS" w:eastAsia="Arial Unicode MS" w:hAnsi="Arial Unicode MS"/>
-                <w:rtl w:val="0"/>
-              </w:rPr>
-              <w:t xml:space="preserve">เลือกจากรายการที่ระบบรองรับ หรือไม่ระบุ</w:t>
-            </w:r>
-          </w:p>
-        </w:tc>
-      </w:tr>
     </w:tbl>
     <w:p>
       <w:pPr>
@@ -2465,6 +2250,445 @@
       <w:pPr>
         <w:numPr>
           <w:ilvl w:val="0"/>
+          <w:numId w:val="5"/>
+        </w:numPr>
+        <w:spacing w:after="0" w:afterAutospacing="0" w:before="240" w:lineRule="auto"/>
+        <w:ind w:left="720" w:hanging="360"/>
+      </w:pPr>
+      <w:r>
+        <w:rPr>
+          <w:rFonts w:ascii="Arial Unicode MS" w:cs="Arial Unicode MS" w:eastAsia="Arial Unicode MS" w:hAnsi="Arial Unicode MS"/>
+          <w:rtl w:val="0"/>
+        </w:rPr>
+        <w:t xml:space="preserve">ต้องระบุรายวิชา ชื่อแนวข้อสอบ ปีการศึกษา ภาคเรียน ช่วงสอบ หัวข้อที่เคยออกสอบ และรูปแบบข้อสอบให้ครบ</w:t>
+      </w:r>
+    </w:p>
+    <w:p>
+      <w:pPr>
+        <w:numPr>
+          <w:ilvl w:val="0"/>
+          <w:numId w:val="5"/>
+        </w:numPr>
+        <w:spacing w:after="0" w:afterAutospacing="0" w:before="0" w:beforeAutospacing="0" w:lineRule="auto"/>
+        <w:ind w:left="720" w:hanging="360"/>
+      </w:pPr>
+      <w:r>
+        <w:rPr>
+          <w:rFonts w:ascii="Arial Unicode MS" w:cs="Arial Unicode MS" w:eastAsia="Arial Unicode MS" w:hAnsi="Arial Unicode MS"/>
+          <w:rtl w:val="0"/>
+        </w:rPr>
+        <w:t xml:space="preserve">ชื่อแนวข้อสอบและหัวข้อที่เคยออกสอบต้องไม่เป็นค่าว่างหรือมีเฉพาะช่องว่าง</w:t>
+      </w:r>
+    </w:p>
+    <w:p>
+      <w:pPr>
+        <w:numPr>
+          <w:ilvl w:val="0"/>
+          <w:numId w:val="5"/>
+        </w:numPr>
+        <w:spacing w:after="0" w:afterAutospacing="0" w:before="0" w:beforeAutospacing="0" w:lineRule="auto"/>
+        <w:ind w:left="720" w:hanging="360"/>
+      </w:pPr>
+      <w:r>
+        <w:rPr>
+          <w:rFonts w:ascii="Arial Unicode MS" w:cs="Arial Unicode MS" w:eastAsia="Arial Unicode MS" w:hAnsi="Arial Unicode MS"/>
+          <w:rtl w:val="0"/>
+        </w:rPr>
+        <w:t xml:space="preserve">ต้องเลือกรูปแบบข้อสอบอย่างน้อยหนึ่งรูปแบบ</w:t>
+      </w:r>
+    </w:p>
+    <w:p>
+      <w:pPr>
+        <w:numPr>
+          <w:ilvl w:val="0"/>
+          <w:numId w:val="5"/>
+        </w:numPr>
+        <w:spacing w:after="0" w:afterAutospacing="0" w:before="0" w:beforeAutospacing="0" w:lineRule="auto"/>
+        <w:ind w:left="720" w:hanging="360"/>
+      </w:pPr>
+      <w:r>
+        <w:rPr>
+          <w:rFonts w:ascii="Arial Unicode MS" w:cs="Arial Unicode MS" w:eastAsia="Arial Unicode MS" w:hAnsi="Arial Unicode MS"/>
+          <w:rtl w:val="0"/>
+        </w:rPr>
+        <w:t xml:space="preserve">หากข้อมูลไม่ครบ ต้องแสดงข้อความแจ้งฟิลด์ที่ต้องแก้ไข โดยไม่สร้างรายการใหม่</w:t>
+      </w:r>
+    </w:p>
+    <w:p>
+      <w:pPr>
+        <w:numPr>
+          <w:ilvl w:val="0"/>
+          <w:numId w:val="5"/>
+        </w:numPr>
+        <w:spacing w:after="240" w:before="0" w:beforeAutospacing="0" w:lineRule="auto"/>
+        <w:ind w:left="720" w:hanging="360"/>
+      </w:pPr>
+      <w:r>
+        <w:rPr>
+          <w:rFonts w:ascii="Arial Unicode MS" w:cs="Arial Unicode MS" w:eastAsia="Arial Unicode MS" w:hAnsi="Arial Unicode MS"/>
+          <w:rtl w:val="0"/>
+        </w:rPr>
+        <w:t xml:space="preserve">เมื่อข้อมูลไม่ผ่านการตรวจสอบ ควรเก็บข้อมูลฟิลด์อื่นที่ผู้ใช้กรอกไว้เพื่อให้แก้ไขต่อได้</w:t>
+      </w:r>
+    </w:p>
+    <w:p>
+      <w:pPr>
+        <w:pStyle w:val="Heading3"/>
+        <w:keepNext w:val="0"/>
+        <w:keepLines w:val="0"/>
+        <w:spacing w:before="280" w:lineRule="auto"/>
+        <w:rPr>
+          <w:b w:val="1"/>
+          <w:bCs w:val="1"/>
+          <w:color w:val="000000"/>
+          <w:sz w:val="26"/>
+          <w:szCs w:val="26"/>
+        </w:rPr>
+      </w:pPr>
+      <w:bookmarkStart w:colFirst="0" w:colLast="0" w:name="_u4ajbe7ie0ty" w:id="5"/>
+      <w:bookmarkEnd w:id="5"/>
+      <w:r>
+        <w:rPr>
+          <w:rFonts w:ascii="Arial Unicode MS" w:cs="Arial Unicode MS" w:eastAsia="Arial Unicode MS" w:hAnsi="Arial Unicode MS"/>
+          <w:b w:val="1"/>
+          <w:bCs w:val="1"/>
+          <w:color w:val="000000"/>
+          <w:sz w:val="26"/>
+          <w:szCs w:val="26"/>
+          <w:rtl w:val="0"/>
+        </w:rPr>
+        <w:t xml:space="preserve">4.2 การตรวจสอบค่าที่เลือก</w:t>
+      </w:r>
+    </w:p>
+    <w:p>
+      <w:pPr>
+        <w:numPr>
+          <w:ilvl w:val="0"/>
+          <w:numId w:val="2"/>
+        </w:numPr>
+        <w:spacing w:after="0" w:afterAutospacing="0" w:before="240" w:lineRule="auto"/>
+        <w:ind w:left="720" w:hanging="360"/>
+      </w:pPr>
+      <w:r>
+        <w:rPr>
+          <w:rFonts w:ascii="Arial Unicode MS" w:cs="Arial Unicode MS" w:eastAsia="Arial Unicode MS" w:hAnsi="Arial Unicode MS"/>
+          <w:rtl w:val="0"/>
+        </w:rPr>
+        <w:t xml:space="preserve">รายวิชาต้องเป็นรายวิชา CS ที่มีอยู่ในระบบ ห้ามสร้างรายวิชาใหม่จากการส่งฟอร์ม</w:t>
+      </w:r>
+    </w:p>
+    <w:p>
+      <w:pPr>
+        <w:numPr>
+          <w:ilvl w:val="0"/>
+          <w:numId w:val="2"/>
+        </w:numPr>
+        <w:spacing w:after="0" w:afterAutospacing="0" w:before="0" w:beforeAutospacing="0" w:lineRule="auto"/>
+        <w:ind w:left="720" w:hanging="360"/>
+      </w:pPr>
+      <w:r>
+        <w:rPr>
+          <w:rFonts w:ascii="Arial Unicode MS" w:cs="Arial Unicode MS" w:eastAsia="Arial Unicode MS" w:hAnsi="Arial Unicode MS"/>
+          <w:rtl w:val="0"/>
+        </w:rPr>
+        <w:t xml:space="preserve">ปีการศึกษาต้องเป็นปี พ.ศ. ที่ระบบกำหนดไว้</w:t>
+      </w:r>
+    </w:p>
+    <w:p>
+      <w:pPr>
+        <w:numPr>
+          <w:ilvl w:val="0"/>
+          <w:numId w:val="2"/>
+        </w:numPr>
+        <w:spacing w:after="0" w:afterAutospacing="0" w:before="0" w:beforeAutospacing="0" w:lineRule="auto"/>
+        <w:ind w:left="720" w:hanging="360"/>
+      </w:pPr>
+      <w:r>
+        <w:rPr>
+          <w:rFonts w:ascii="Arial Unicode MS" w:cs="Arial Unicode MS" w:eastAsia="Arial Unicode MS" w:hAnsi="Arial Unicode MS"/>
+          <w:rtl w:val="0"/>
+        </w:rPr>
+        <w:t xml:space="preserve">ภาคเรียนต้องเป็น 1, 2 หรือฤดูร้อน</w:t>
+      </w:r>
+    </w:p>
+    <w:p>
+      <w:pPr>
+        <w:numPr>
+          <w:ilvl w:val="0"/>
+          <w:numId w:val="2"/>
+        </w:numPr>
+        <w:spacing w:after="0" w:afterAutospacing="0" w:before="0" w:beforeAutospacing="0" w:lineRule="auto"/>
+        <w:ind w:left="720" w:hanging="360"/>
+      </w:pPr>
+      <w:r>
+        <w:rPr>
+          <w:rFonts w:ascii="Arial Unicode MS" w:cs="Arial Unicode MS" w:eastAsia="Arial Unicode MS" w:hAnsi="Arial Unicode MS"/>
+          <w:rtl w:val="0"/>
+        </w:rPr>
+        <w:t xml:space="preserve">ช่วงสอบต้องเป็นกลางภาคหรือปลายภาค</w:t>
+      </w:r>
+    </w:p>
+    <w:p>
+      <w:pPr>
+        <w:numPr>
+          <w:ilvl w:val="0"/>
+          <w:numId w:val="2"/>
+        </w:numPr>
+        <w:spacing w:after="0" w:afterAutospacing="0" w:before="0" w:beforeAutospacing="0" w:lineRule="auto"/>
+        <w:ind w:left="720" w:hanging="360"/>
+      </w:pPr>
+      <w:r>
+        <w:rPr>
+          <w:rFonts w:ascii="Arial Unicode MS" w:cs="Arial Unicode MS" w:eastAsia="Arial Unicode MS" w:hAnsi="Arial Unicode MS"/>
+          <w:rtl w:val="0"/>
+        </w:rPr>
+        <w:t xml:space="preserve">รูปแบบข้อสอบต้องเป็นปรนัย อัตนัย ผสม หรืออื่น ๆ</w:t>
+      </w:r>
+    </w:p>
+    <w:p>
+      <w:pPr>
+        <w:numPr>
+          <w:ilvl w:val="0"/>
+          <w:numId w:val="2"/>
+        </w:numPr>
+        <w:spacing w:after="240" w:before="0" w:beforeAutospacing="0" w:lineRule="auto"/>
+        <w:ind w:left="720" w:hanging="360"/>
+      </w:pPr>
+      <w:r>
+        <w:rPr>
+          <w:rFonts w:ascii="Arial Unicode MS" w:cs="Arial Unicode MS" w:eastAsia="Arial Unicode MS" w:hAnsi="Arial Unicode MS"/>
+          <w:rtl w:val="0"/>
+        </w:rPr>
+        <w:t xml:space="preserve">Backend ต้องตรวจสอบค่าที่ส่งมาอีกครั้ง ไม่เชื่อถือเฉพาะการตรวจสอบจากหน้าเว็บ</w:t>
+      </w:r>
+    </w:p>
+    <w:p>
+      <w:pPr>
+        <w:pStyle w:val="Heading3"/>
+        <w:keepNext w:val="0"/>
+        <w:keepLines w:val="0"/>
+        <w:spacing w:before="280" w:lineRule="auto"/>
+        <w:rPr>
+          <w:b w:val="1"/>
+          <w:bCs w:val="1"/>
+          <w:color w:val="000000"/>
+          <w:sz w:val="26"/>
+          <w:szCs w:val="26"/>
+        </w:rPr>
+      </w:pPr>
+      <w:bookmarkStart w:colFirst="0" w:colLast="0" w:name="_z8jibj5wgwtp" w:id="6"/>
+      <w:bookmarkEnd w:id="6"/>
+      <w:r>
+        <w:rPr>
+          <w:rFonts w:ascii="Arial Unicode MS" w:cs="Arial Unicode MS" w:eastAsia="Arial Unicode MS" w:hAnsi="Arial Unicode MS"/>
+          <w:b w:val="1"/>
+          <w:bCs w:val="1"/>
+          <w:color w:val="000000"/>
+          <w:sz w:val="26"/>
+          <w:szCs w:val="26"/>
+          <w:rtl w:val="0"/>
+        </w:rPr>
+        <w:t xml:space="preserve">4.3 การตรวจสอบจำนวนข้อสอบ</w:t>
+      </w:r>
+    </w:p>
+    <w:p>
+      <w:pPr>
+        <w:numPr>
+          <w:ilvl w:val="0"/>
+          <w:numId w:val="3"/>
+        </w:numPr>
+        <w:spacing w:after="0" w:afterAutospacing="0" w:before="240" w:lineRule="auto"/>
+        <w:ind w:left="720" w:hanging="360"/>
+      </w:pPr>
+      <w:r>
+        <w:rPr>
+          <w:rFonts w:ascii="Arial Unicode MS" w:cs="Arial Unicode MS" w:eastAsia="Arial Unicode MS" w:hAnsi="Arial Unicode MS"/>
+          <w:rtl w:val="0"/>
+        </w:rPr>
+        <w:t xml:space="preserve">อนุญาตให้เลือกไม่ระบุจำนวนข้อสอบได้</w:t>
+      </w:r>
+    </w:p>
+    <w:p>
+      <w:pPr>
+        <w:numPr>
+          <w:ilvl w:val="0"/>
+          <w:numId w:val="3"/>
+        </w:numPr>
+        <w:spacing w:after="0" w:afterAutospacing="0" w:before="0" w:beforeAutospacing="0" w:lineRule="auto"/>
+        <w:ind w:left="720" w:hanging="360"/>
+      </w:pPr>
+      <w:r>
+        <w:rPr>
+          <w:rFonts w:ascii="Arial Unicode MS" w:cs="Arial Unicode MS" w:eastAsia="Arial Unicode MS" w:hAnsi="Arial Unicode MS"/>
+          <w:rtl w:val="0"/>
+        </w:rPr>
+        <w:t xml:space="preserve">หากระบุจำนวนข้อสอบ ต้องเป็นจำนวนเต็มมากกว่า 0</w:t>
+      </w:r>
+    </w:p>
+    <w:p>
+      <w:pPr>
+        <w:numPr>
+          <w:ilvl w:val="0"/>
+          <w:numId w:val="3"/>
+        </w:numPr>
+        <w:spacing w:after="0" w:afterAutospacing="0" w:before="0" w:beforeAutospacing="0" w:lineRule="auto"/>
+        <w:ind w:left="720" w:hanging="360"/>
+      </w:pPr>
+      <w:r>
+        <w:rPr>
+          <w:rFonts w:ascii="Arial Unicode MS" w:cs="Arial Unicode MS" w:eastAsia="Arial Unicode MS" w:hAnsi="Arial Unicode MS"/>
+          <w:rtl w:val="0"/>
+        </w:rPr>
+        <w:t xml:space="preserve">ต้องปฏิเสธค่า 0, จำนวนติดลบ, ทศนิยม และข้อความที่ไม่ใช่จำนวน</w:t>
+      </w:r>
+    </w:p>
+    <w:p>
+      <w:pPr>
+        <w:numPr>
+          <w:ilvl w:val="0"/>
+          <w:numId w:val="3"/>
+        </w:numPr>
+        <w:spacing w:after="240" w:before="0" w:beforeAutospacing="0" w:lineRule="auto"/>
+        <w:ind w:left="720" w:hanging="360"/>
+      </w:pPr>
+      <w:r>
+        <w:rPr>
+          <w:rFonts w:ascii="Arial Unicode MS" w:cs="Arial Unicode MS" w:eastAsia="Arial Unicode MS" w:hAnsi="Arial Unicode MS"/>
+          <w:rtl w:val="0"/>
+        </w:rPr>
+        <w:t xml:space="preserve">เมื่อเลือกไม่ระบุ ให้แสดงว่าไม่ระบุ ไม่แทนค่าด้วย 0</w:t>
+      </w:r>
+    </w:p>
+    <w:p>
+      <w:pPr>
+        <w:pStyle w:val="Heading3"/>
+        <w:keepNext w:val="0"/>
+        <w:keepLines w:val="0"/>
+        <w:spacing w:before="280" w:lineRule="auto"/>
+        <w:rPr>
+          <w:b w:val="1"/>
+          <w:bCs w:val="1"/>
+          <w:color w:val="000000"/>
+          <w:sz w:val="26"/>
+          <w:szCs w:val="26"/>
+        </w:rPr>
+      </w:pPr>
+      <w:bookmarkStart w:colFirst="0" w:colLast="0" w:name="_iqecihfp15jo" w:id="7"/>
+      <w:bookmarkEnd w:id="7"/>
+      <w:r>
+        <w:rPr>
+          <w:rFonts w:ascii="Arial Unicode MS" w:cs="Arial Unicode MS" w:eastAsia="Arial Unicode MS" w:hAnsi="Arial Unicode MS"/>
+          <w:b w:val="1"/>
+          <w:bCs w:val="1"/>
+          <w:color w:val="000000"/>
+          <w:sz w:val="26"/>
+          <w:szCs w:val="26"/>
+          <w:rtl w:val="0"/>
+        </w:rPr>
+        <w:t xml:space="preserve">4.4 การตรวจสอบเจ้าของรายการและสถานะ Login</w:t>
+      </w:r>
+    </w:p>
+    <w:p>
+      <w:pPr>
+        <w:numPr>
+          <w:ilvl w:val="0"/>
+          <w:numId w:val="1"/>
+        </w:numPr>
+        <w:spacing w:after="0" w:afterAutospacing="0" w:before="240" w:lineRule="auto"/>
+        <w:ind w:left="720" w:hanging="360"/>
+      </w:pPr>
+      <w:r>
+        <w:rPr>
+          <w:rFonts w:ascii="Arial Unicode MS" w:cs="Arial Unicode MS" w:eastAsia="Arial Unicode MS" w:hAnsi="Arial Unicode MS"/>
+          <w:rtl w:val="0"/>
+        </w:rPr>
+        <w:t xml:space="preserve">ผู้เผยแพร่ต้องเข้าสู่ระบบก่อนส่งข้อมูล</w:t>
+      </w:r>
+    </w:p>
+    <w:p>
+      <w:pPr>
+        <w:numPr>
+          <w:ilvl w:val="0"/>
+          <w:numId w:val="1"/>
+        </w:numPr>
+        <w:spacing w:after="0" w:afterAutospacing="0" w:before="0" w:beforeAutospacing="0" w:lineRule="auto"/>
+        <w:ind w:left="720" w:hanging="360"/>
+      </w:pPr>
+      <w:r>
+        <w:rPr>
+          <w:rFonts w:ascii="Arial Unicode MS" w:cs="Arial Unicode MS" w:eastAsia="Arial Unicode MS" w:hAnsi="Arial Unicode MS"/>
+          <w:rtl w:val="0"/>
+        </w:rPr>
+        <w:t xml:space="preserve">เจ้าของรายการต้องอ้างอิงจากบัญชีผู้ใช้ที่ผ่านการยืนยันตัวตนจาก Backend</w:t>
+      </w:r>
+    </w:p>
+    <w:p>
+      <w:pPr>
+        <w:numPr>
+          <w:ilvl w:val="0"/>
+          <w:numId w:val="1"/>
+        </w:numPr>
+        <w:spacing w:after="0" w:afterAutospacing="0" w:before="0" w:beforeAutospacing="0" w:lineRule="auto"/>
+        <w:ind w:left="720" w:hanging="360"/>
+      </w:pPr>
+      <w:r>
+        <w:rPr>
+          <w:rFonts w:ascii="Arial Unicode MS" w:cs="Arial Unicode MS" w:eastAsia="Arial Unicode MS" w:hAnsi="Arial Unicode MS"/>
+          <w:rtl w:val="0"/>
+        </w:rPr>
+        <w:t xml:space="preserve">ไม่ให้ผู้ใช้กำหนดเจ้าของรายการผ่านฟอร์มเอง</w:t>
+      </w:r>
+    </w:p>
+    <w:p>
+      <w:pPr>
+        <w:numPr>
+          <w:ilvl w:val="0"/>
+          <w:numId w:val="1"/>
+        </w:numPr>
+        <w:spacing w:after="240" w:before="0" w:beforeAutospacing="0" w:lineRule="auto"/>
+        <w:ind w:left="720" w:hanging="360"/>
+      </w:pPr>
+      <w:r>
+        <w:rPr>
+          <w:rFonts w:ascii="Arial Unicode MS" w:cs="Arial Unicode MS" w:eastAsia="Arial Unicode MS" w:hAnsi="Arial Unicode MS"/>
+          <w:rtl w:val="0"/>
+        </w:rPr>
+        <w:t xml:space="preserve">หากสถานะ Login ใช้ไม่ได้ Backend ต้องปฏิเสธการเผยแพร่ และหน้าเว็บแจ้งให้ Login ใหม่</w:t>
+      </w:r>
+    </w:p>
+    <w:p>
+      <w:pPr>
+        <w:pStyle w:val="Heading3"/>
+        <w:keepNext w:val="0"/>
+        <w:keepLines w:val="0"/>
+        <w:spacing w:before="280" w:lineRule="auto"/>
+        <w:rPr>
+          <w:b w:val="1"/>
+          <w:bCs w:val="1"/>
+          <w:color w:val="000000"/>
+          <w:sz w:val="26"/>
+          <w:szCs w:val="26"/>
+        </w:rPr>
+      </w:pPr>
+      <w:bookmarkStart w:colFirst="0" w:colLast="0" w:name="_vzqeuyvu4z0f" w:id="8"/>
+      <w:bookmarkEnd w:id="8"/>
+      <w:r>
+        <w:rPr>
+          <w:rFonts w:ascii="Arial Unicode MS" w:cs="Arial Unicode MS" w:eastAsia="Arial Unicode MS" w:hAnsi="Arial Unicode MS"/>
+          <w:b w:val="1"/>
+          <w:bCs w:val="1"/>
+          <w:color w:val="000000"/>
+          <w:sz w:val="26"/>
+          <w:szCs w:val="26"/>
+          <w:rtl w:val="0"/>
+        </w:rPr>
+        <w:t xml:space="preserve">4.5 การบันทึกและเผยแพร่</w:t>
+      </w:r>
+    </w:p>
+    <w:p>
+      <w:pPr>
+        <w:numPr>
+          <w:ilvl w:val="0"/>
           <w:numId w:val="6"/>
         </w:numPr>
         <w:spacing w:after="0" w:afterAutospacing="0" w:before="240" w:lineRule="auto"/>
@@ -2475,7 +2699,7 @@
           <w:rFonts w:ascii="Arial Unicode MS" w:cs="Arial Unicode MS" w:eastAsia="Arial Unicode MS" w:hAnsi="Arial Unicode MS"/>
           <w:rtl w:val="0"/>
         </w:rPr>
-        <w:t xml:space="preserve">ต้องระบุรายวิชา ชื่อแนวข้อสอบ ปีการศึกษา ภาคเรียน ช่วงสอบ หัวข้อที่เคยออกสอบ และรูปแบบข้อสอบให้ครบ</w:t>
+        <w:t xml:space="preserve">เมื่อข้อมูลผ่านการตรวจสอบและบันทึกสำเร็จ ให้สร้างรายการแนวข้อสอบเพียงหนึ่งรายการต่อการส่งหนึ่งครั้ง</w:t>
       </w:r>
     </w:p>
     <w:p>
@@ -2492,7 +2716,7 @@
           <w:rFonts w:ascii="Arial Unicode MS" w:cs="Arial Unicode MS" w:eastAsia="Arial Unicode MS" w:hAnsi="Arial Unicode MS"/>
           <w:rtl w:val="0"/>
         </w:rPr>
-        <w:t xml:space="preserve">ชื่อแนวข้อสอบและหัวข้อที่เคยออกสอบต้องไม่เป็นค่าว่างหรือมีเฉพาะช่องว่าง</w:t>
+        <w:t xml:space="preserve">แสดงข้อความแจ้งสำเร็จและเปิดหน้ารายละเอียดของรายการที่เผยแพร่</w:t>
       </w:r>
     </w:p>
     <w:p>
@@ -2509,7 +2733,7 @@
           <w:rFonts w:ascii="Arial Unicode MS" w:cs="Arial Unicode MS" w:eastAsia="Arial Unicode MS" w:hAnsi="Arial Unicode MS"/>
           <w:rtl w:val="0"/>
         </w:rPr>
-        <w:t xml:space="preserve">ต้องเลือกรูปแบบข้อสอบอย่างน้อยหนึ่งรูปแบบ</w:t>
+        <w:t xml:space="preserve">รายการต้องปรากฏในหน้ารายวิชาและหน้ารายการของผู้เผยแพร่</w:t>
       </w:r>
     </w:p>
     <w:p>
@@ -2526,7 +2750,24 @@
           <w:rFonts w:ascii="Arial Unicode MS" w:cs="Arial Unicode MS" w:eastAsia="Arial Unicode MS" w:hAnsi="Arial Unicode MS"/>
           <w:rtl w:val="0"/>
         </w:rPr>
-        <w:t xml:space="preserve">หากข้อมูลไม่ครบ ต้องแสดงข้อความแจ้งฟิลด์ที่ต้องแก้ไข โดยไม่สร้างรายการใหม่</w:t>
+        <w:t xml:space="preserve">นักศึกษาคนอื่นที่ Login สามารถอ่านรายการได้ทันทีโดยไม่ต้องรออนุมัติ</w:t>
+      </w:r>
+    </w:p>
+    <w:p>
+      <w:pPr>
+        <w:numPr>
+          <w:ilvl w:val="0"/>
+          <w:numId w:val="6"/>
+        </w:numPr>
+        <w:spacing w:after="0" w:afterAutospacing="0" w:before="0" w:beforeAutospacing="0" w:lineRule="auto"/>
+        <w:ind w:left="720" w:hanging="360"/>
+      </w:pPr>
+      <w:r>
+        <w:rPr>
+          <w:rFonts w:ascii="Arial Unicode MS" w:cs="Arial Unicode MS" w:eastAsia="Arial Unicode MS" w:hAnsi="Arial Unicode MS"/>
+          <w:rtl w:val="0"/>
+        </w:rPr>
+        <w:t xml:space="preserve">ข้อมูลต้องยังคงอยู่หลังโหลดหน้าใหม่</w:t>
       </w:r>
     </w:p>
     <w:p>
@@ -2543,167 +2784,34 @@
           <w:rFonts w:ascii="Arial Unicode MS" w:cs="Arial Unicode MS" w:eastAsia="Arial Unicode MS" w:hAnsi="Arial Unicode MS"/>
           <w:rtl w:val="0"/>
         </w:rPr>
-        <w:t xml:space="preserve">เมื่อข้อมูลไม่ผ่านการตรวจสอบ ควรเก็บข้อมูลฟิลด์อื่นที่ผู้ใช้กรอกไว้เพื่อให้แก้ไขต่อได้</w:t>
-      </w:r>
-    </w:p>
-    <w:p>
-      <w:pPr>
-        <w:pStyle w:val="Heading3"/>
+        <w:t xml:space="preserve">หากบันทึกล้มเหลว ต้องไม่แสดงข้อความว่าสำเร็จ และต้องไม่มีข้อมูลที่บันทึกค้างไว้บางส่วน</w:t>
+      </w:r>
+    </w:p>
+    <w:p>
+      <w:pPr>
+        <w:pStyle w:val="Heading2"/>
         <w:keepNext w:val="0"/>
         <w:keepLines w:val="0"/>
-        <w:spacing w:before="280" w:lineRule="auto"/>
+        <w:spacing w:after="80" w:lineRule="auto"/>
         <w:rPr>
           <w:b w:val="1"/>
           <w:bCs w:val="1"/>
-          <w:color w:val="000000"/>
-          <w:sz w:val="26"/>
-          <w:szCs w:val="26"/>
-        </w:rPr>
-      </w:pPr>
-      <w:bookmarkStart w:colFirst="0" w:colLast="0" w:name="_u4ajbe7ie0ty" w:id="5"/>
-      <w:bookmarkEnd w:id="5"/>
+          <w:sz w:val="34"/>
+          <w:szCs w:val="34"/>
+        </w:rPr>
+      </w:pPr>
+      <w:bookmarkStart w:colFirst="0" w:colLast="0" w:name="_30laczme4o5b" w:id="9"/>
+      <w:bookmarkEnd w:id="9"/>
       <w:r>
         <w:rPr>
           <w:rFonts w:ascii="Arial Unicode MS" w:cs="Arial Unicode MS" w:eastAsia="Arial Unicode MS" w:hAnsi="Arial Unicode MS"/>
           <w:b w:val="1"/>
           <w:bCs w:val="1"/>
-          <w:color w:val="000000"/>
-          <w:sz w:val="26"/>
-          <w:szCs w:val="26"/>
-          <w:rtl w:val="0"/>
-        </w:rPr>
-        <w:t xml:space="preserve">4.2 การตรวจสอบค่าที่เลือก</w:t>
-      </w:r>
-    </w:p>
-    <w:p>
-      <w:pPr>
-        <w:numPr>
-          <w:ilvl w:val="0"/>
-          <w:numId w:val="3"/>
-        </w:numPr>
-        <w:spacing w:after="0" w:afterAutospacing="0" w:before="240" w:lineRule="auto"/>
-        <w:ind w:left="720" w:hanging="360"/>
-      </w:pPr>
-      <w:r>
-        <w:rPr>
-          <w:rFonts w:ascii="Arial Unicode MS" w:cs="Arial Unicode MS" w:eastAsia="Arial Unicode MS" w:hAnsi="Arial Unicode MS"/>
-          <w:rtl w:val="0"/>
-        </w:rPr>
-        <w:t xml:space="preserve">รายวิชาต้องเป็นรายวิชา CS ที่มีอยู่ในระบบ ห้ามสร้างรายวิชาใหม่จากการส่งฟอร์ม</w:t>
-      </w:r>
-    </w:p>
-    <w:p>
-      <w:pPr>
-        <w:numPr>
-          <w:ilvl w:val="0"/>
-          <w:numId w:val="3"/>
-        </w:numPr>
-        <w:spacing w:after="0" w:afterAutospacing="0" w:before="0" w:beforeAutospacing="0" w:lineRule="auto"/>
-        <w:ind w:left="720" w:hanging="360"/>
-      </w:pPr>
-      <w:r>
-        <w:rPr>
-          <w:rFonts w:ascii="Arial Unicode MS" w:cs="Arial Unicode MS" w:eastAsia="Arial Unicode MS" w:hAnsi="Arial Unicode MS"/>
-          <w:rtl w:val="0"/>
-        </w:rPr>
-        <w:t xml:space="preserve">ปีการศึกษาต้องเป็นปี พ.ศ. ที่ระบบกำหนดไว้</w:t>
-      </w:r>
-    </w:p>
-    <w:p>
-      <w:pPr>
-        <w:numPr>
-          <w:ilvl w:val="0"/>
-          <w:numId w:val="3"/>
-        </w:numPr>
-        <w:spacing w:after="0" w:afterAutospacing="0" w:before="0" w:beforeAutospacing="0" w:lineRule="auto"/>
-        <w:ind w:left="720" w:hanging="360"/>
-      </w:pPr>
-      <w:r>
-        <w:rPr>
-          <w:rFonts w:ascii="Arial Unicode MS" w:cs="Arial Unicode MS" w:eastAsia="Arial Unicode MS" w:hAnsi="Arial Unicode MS"/>
-          <w:rtl w:val="0"/>
-        </w:rPr>
-        <w:t xml:space="preserve">ภาคเรียนต้องเป็น 1, 2 หรือฤดูร้อน</w:t>
-      </w:r>
-    </w:p>
-    <w:p>
-      <w:pPr>
-        <w:numPr>
-          <w:ilvl w:val="0"/>
-          <w:numId w:val="3"/>
-        </w:numPr>
-        <w:spacing w:after="0" w:afterAutospacing="0" w:before="0" w:beforeAutospacing="0" w:lineRule="auto"/>
-        <w:ind w:left="720" w:hanging="360"/>
-      </w:pPr>
-      <w:r>
-        <w:rPr>
-          <w:rFonts w:ascii="Arial Unicode MS" w:cs="Arial Unicode MS" w:eastAsia="Arial Unicode MS" w:hAnsi="Arial Unicode MS"/>
-          <w:rtl w:val="0"/>
-        </w:rPr>
-        <w:t xml:space="preserve">ช่วงสอบต้องเป็นกลางภาคหรือปลายภาค</w:t>
-      </w:r>
-    </w:p>
-    <w:p>
-      <w:pPr>
-        <w:numPr>
-          <w:ilvl w:val="0"/>
-          <w:numId w:val="3"/>
-        </w:numPr>
-        <w:spacing w:after="0" w:afterAutospacing="0" w:before="0" w:beforeAutospacing="0" w:lineRule="auto"/>
-        <w:ind w:left="720" w:hanging="360"/>
-      </w:pPr>
-      <w:r>
-        <w:rPr>
-          <w:rFonts w:ascii="Arial Unicode MS" w:cs="Arial Unicode MS" w:eastAsia="Arial Unicode MS" w:hAnsi="Arial Unicode MS"/>
-          <w:rtl w:val="0"/>
-        </w:rPr>
-        <w:t xml:space="preserve">รูปแบบข้อสอบต้องเป็นปรนัย อัตนัย ผสม หรืออื่น ๆ</w:t>
-      </w:r>
-    </w:p>
-    <w:p>
-      <w:pPr>
-        <w:numPr>
-          <w:ilvl w:val="0"/>
-          <w:numId w:val="3"/>
-        </w:numPr>
-        <w:spacing w:after="240" w:before="0" w:beforeAutospacing="0" w:lineRule="auto"/>
-        <w:ind w:left="720" w:hanging="360"/>
-      </w:pPr>
-      <w:r>
-        <w:rPr>
-          <w:rFonts w:ascii="Arial Unicode MS" w:cs="Arial Unicode MS" w:eastAsia="Arial Unicode MS" w:hAnsi="Arial Unicode MS"/>
-          <w:rtl w:val="0"/>
-        </w:rPr>
-        <w:t xml:space="preserve">Backend ต้องตรวจสอบค่าที่ส่งมาอีกครั้ง ไม่เชื่อถือเฉพาะการตรวจสอบจากหน้าเว็บ</w:t>
-      </w:r>
-    </w:p>
-    <w:p>
-      <w:pPr>
-        <w:pStyle w:val="Heading3"/>
-        <w:keepNext w:val="0"/>
-        <w:keepLines w:val="0"/>
-        <w:spacing w:before="280" w:lineRule="auto"/>
-        <w:rPr>
-          <w:b w:val="1"/>
-          <w:bCs w:val="1"/>
-          <w:color w:val="000000"/>
-          <w:sz w:val="26"/>
-          <w:szCs w:val="26"/>
-        </w:rPr>
-      </w:pPr>
-      <w:bookmarkStart w:colFirst="0" w:colLast="0" w:name="_z8jibj5wgwtp" w:id="6"/>
-      <w:bookmarkEnd w:id="6"/>
-      <w:r>
-        <w:rPr>
-          <w:rFonts w:ascii="Arial Unicode MS" w:cs="Arial Unicode MS" w:eastAsia="Arial Unicode MS" w:hAnsi="Arial Unicode MS"/>
-          <w:b w:val="1"/>
-          <w:bCs w:val="1"/>
-          <w:color w:val="000000"/>
-          <w:sz w:val="26"/>
-          <w:szCs w:val="26"/>
-          <w:rtl w:val="0"/>
-        </w:rPr>
-        <w:t xml:space="preserve">4.3 การตรวจสอบจำนวนข้อสอบ</w:t>
+          <w:sz w:val="34"/>
+          <w:szCs w:val="34"/>
+          <w:rtl w:val="0"/>
+        </w:rPr>
+        <w:t xml:space="preserve">5. ผลลัพธ์ที่คาดหวัง</w:t>
       </w:r>
     </w:p>
     <w:p>
@@ -2720,7 +2828,7 @@
           <w:rFonts w:ascii="Arial Unicode MS" w:cs="Arial Unicode MS" w:eastAsia="Arial Unicode MS" w:hAnsi="Arial Unicode MS"/>
           <w:rtl w:val="0"/>
         </w:rPr>
-        <w:t xml:space="preserve">อนุญาตให้เลือกไม่ระบุจำนวนข้อสอบได้</w:t>
+        <w:t xml:space="preserve">ข้อมูลไม่ครบหรือไม่ถูกต้อง: แจ้งข้อผิดพลาดและไม่สร้างรายการ</w:t>
       </w:r>
     </w:p>
     <w:p>
@@ -2737,7 +2845,7 @@
           <w:rFonts w:ascii="Arial Unicode MS" w:cs="Arial Unicode MS" w:eastAsia="Arial Unicode MS" w:hAnsi="Arial Unicode MS"/>
           <w:rtl w:val="0"/>
         </w:rPr>
-        <w:t xml:space="preserve">หากระบุจำนวนข้อสอบ ต้องเป็นจำนวนเต็มมากกว่า 0</w:t>
+        <w:t xml:space="preserve">ข้อมูลถูกต้องและบันทึกสำเร็จ: เผยแพร่รายการและเปิดอ่านได้ทันที</w:t>
       </w:r>
     </w:p>
     <w:p>
@@ -2754,7 +2862,24 @@
           <w:rFonts w:ascii="Arial Unicode MS" w:cs="Arial Unicode MS" w:eastAsia="Arial Unicode MS" w:hAnsi="Arial Unicode MS"/>
           <w:rtl w:val="0"/>
         </w:rPr>
-        <w:t xml:space="preserve">ต้องปฏิเสธค่า 0, จำนวนติดลบ, ทศนิยม และข้อความที่ไม่ใช่จำนวน</w:t>
+        <w:t xml:space="preserve">ผู้เผยแพร่และนักศึกษาคนอื่นที่ Login สามารถเปิดอ่านข้อมูลตามสิทธิ์ที่กำหนด</w:t>
+      </w:r>
+    </w:p>
+    <w:p>
+      <w:pPr>
+        <w:numPr>
+          <w:ilvl w:val="0"/>
+          <w:numId w:val="4"/>
+        </w:numPr>
+        <w:spacing w:after="0" w:afterAutospacing="0" w:before="0" w:beforeAutospacing="0" w:lineRule="auto"/>
+        <w:ind w:left="720" w:hanging="360"/>
+      </w:pPr>
+      <w:r>
+        <w:rPr>
+          <w:rFonts w:ascii="Arial Unicode MS" w:cs="Arial Unicode MS" w:eastAsia="Arial Unicode MS" w:hAnsi="Arial Unicode MS"/>
+          <w:rtl w:val="0"/>
+        </w:rPr>
+        <w:t xml:space="preserve">ข้อมูลเจ้าของรายการต้องตรงกับบัญชีผู้ใช้ที่ผ่านการยืนยันตัวตน</w:t>
       </w:r>
     </w:p>
     <w:p>
@@ -2771,566 +2896,13 @@
           <w:rFonts w:ascii="Arial Unicode MS" w:cs="Arial Unicode MS" w:eastAsia="Arial Unicode MS" w:hAnsi="Arial Unicode MS"/>
           <w:rtl w:val="0"/>
         </w:rPr>
-        <w:t xml:space="preserve">เมื่อเลือกไม่ระบุ ให้แสดงว่าไม่ระบุ ไม่แทนค่าด้วย 0</w:t>
-      </w:r>
-    </w:p>
-    <w:p>
-      <w:pPr>
-        <w:pStyle w:val="Heading3"/>
-        <w:keepNext w:val="0"/>
-        <w:keepLines w:val="0"/>
-        <w:spacing w:before="280" w:lineRule="auto"/>
-        <w:rPr>
-          <w:b w:val="1"/>
-          <w:bCs w:val="1"/>
-          <w:color w:val="000000"/>
-          <w:sz w:val="26"/>
-          <w:szCs w:val="26"/>
-        </w:rPr>
-      </w:pPr>
-      <w:bookmarkStart w:colFirst="0" w:colLast="0" w:name="_iqecihfp15jo" w:id="7"/>
-      <w:bookmarkEnd w:id="7"/>
-      <w:r>
-        <w:rPr>
-          <w:rFonts w:ascii="Arial Unicode MS" w:cs="Arial Unicode MS" w:eastAsia="Arial Unicode MS" w:hAnsi="Arial Unicode MS"/>
-          <w:b w:val="1"/>
-          <w:bCs w:val="1"/>
-          <w:color w:val="000000"/>
-          <w:sz w:val="26"/>
-          <w:szCs w:val="26"/>
-          <w:rtl w:val="0"/>
-        </w:rPr>
-        <w:t xml:space="preserve">4.4 การตรวจสอบเจ้าของรายการและสถานะ Login</w:t>
-      </w:r>
-    </w:p>
-    <w:p>
-      <w:pPr>
-        <w:numPr>
-          <w:ilvl w:val="0"/>
-          <w:numId w:val="1"/>
-        </w:numPr>
-        <w:spacing w:after="0" w:afterAutospacing="0" w:before="240" w:lineRule="auto"/>
-        <w:ind w:left="720" w:hanging="360"/>
-      </w:pPr>
-      <w:r>
-        <w:rPr>
-          <w:rFonts w:ascii="Arial Unicode MS" w:cs="Arial Unicode MS" w:eastAsia="Arial Unicode MS" w:hAnsi="Arial Unicode MS"/>
-          <w:rtl w:val="0"/>
-        </w:rPr>
-        <w:t xml:space="preserve">ผู้เผยแพร่ต้องเข้าสู่ระบบก่อนส่งข้อมูล</w:t>
-      </w:r>
-    </w:p>
-    <w:p>
-      <w:pPr>
-        <w:numPr>
-          <w:ilvl w:val="0"/>
-          <w:numId w:val="1"/>
-        </w:numPr>
-        <w:spacing w:after="0" w:afterAutospacing="0" w:before="0" w:beforeAutospacing="0" w:lineRule="auto"/>
-        <w:ind w:left="720" w:hanging="360"/>
-      </w:pPr>
-      <w:r>
-        <w:rPr>
-          <w:rFonts w:ascii="Arial Unicode MS" w:cs="Arial Unicode MS" w:eastAsia="Arial Unicode MS" w:hAnsi="Arial Unicode MS"/>
-          <w:rtl w:val="0"/>
-        </w:rPr>
-        <w:t xml:space="preserve">เจ้าของรายการต้องอ้างอิงจากบัญชีผู้ใช้ที่ผ่านการยืนยันตัวตนจาก Backend</w:t>
-      </w:r>
-    </w:p>
-    <w:p>
-      <w:pPr>
-        <w:numPr>
-          <w:ilvl w:val="0"/>
-          <w:numId w:val="1"/>
-        </w:numPr>
-        <w:spacing w:after="0" w:afterAutospacing="0" w:before="0" w:beforeAutospacing="0" w:lineRule="auto"/>
-        <w:ind w:left="720" w:hanging="360"/>
-      </w:pPr>
-      <w:r>
-        <w:rPr>
-          <w:rFonts w:ascii="Arial Unicode MS" w:cs="Arial Unicode MS" w:eastAsia="Arial Unicode MS" w:hAnsi="Arial Unicode MS"/>
-          <w:rtl w:val="0"/>
-        </w:rPr>
-        <w:t xml:space="preserve">ไม่ให้ผู้ใช้กำหนดเจ้าของรายการผ่านฟอร์มเอง</w:t>
-      </w:r>
-    </w:p>
-    <w:p>
-      <w:pPr>
-        <w:numPr>
-          <w:ilvl w:val="0"/>
-          <w:numId w:val="1"/>
-        </w:numPr>
-        <w:spacing w:after="240" w:before="0" w:beforeAutospacing="0" w:lineRule="auto"/>
-        <w:ind w:left="720" w:hanging="360"/>
-      </w:pPr>
-      <w:r>
-        <w:rPr>
-          <w:rFonts w:ascii="Arial Unicode MS" w:cs="Arial Unicode MS" w:eastAsia="Arial Unicode MS" w:hAnsi="Arial Unicode MS"/>
-          <w:rtl w:val="0"/>
-        </w:rPr>
-        <w:t xml:space="preserve">หากสถานะ Login ใช้ไม่ได้ Backend ต้องปฏิเสธการเผยแพร่ และหน้าเว็บแจ้งให้ Login ใหม่</w:t>
-      </w:r>
-    </w:p>
-    <w:p>
-      <w:pPr>
-        <w:pStyle w:val="Heading3"/>
-        <w:keepNext w:val="0"/>
-        <w:keepLines w:val="0"/>
-        <w:spacing w:before="280" w:lineRule="auto"/>
-        <w:rPr>
-          <w:b w:val="1"/>
-          <w:bCs w:val="1"/>
-          <w:color w:val="000000"/>
-          <w:sz w:val="26"/>
-          <w:szCs w:val="26"/>
-        </w:rPr>
-      </w:pPr>
-      <w:bookmarkStart w:colFirst="0" w:colLast="0" w:name="_vzqeuyvu4z0f" w:id="8"/>
-      <w:bookmarkEnd w:id="8"/>
-      <w:r>
-        <w:rPr>
-          <w:rFonts w:ascii="Arial Unicode MS" w:cs="Arial Unicode MS" w:eastAsia="Arial Unicode MS" w:hAnsi="Arial Unicode MS"/>
-          <w:b w:val="1"/>
-          <w:bCs w:val="1"/>
-          <w:color w:val="000000"/>
-          <w:sz w:val="26"/>
-          <w:szCs w:val="26"/>
-          <w:rtl w:val="0"/>
-        </w:rPr>
-        <w:t xml:space="preserve">4.5 การบันทึกและเผยแพร่</w:t>
-      </w:r>
-    </w:p>
-    <w:p>
-      <w:pPr>
-        <w:numPr>
-          <w:ilvl w:val="0"/>
-          <w:numId w:val="8"/>
-        </w:numPr>
-        <w:spacing w:after="0" w:afterAutospacing="0" w:before="240" w:lineRule="auto"/>
-        <w:ind w:left="720" w:hanging="360"/>
-      </w:pPr>
-      <w:r>
-        <w:rPr>
-          <w:rFonts w:ascii="Arial Unicode MS" w:cs="Arial Unicode MS" w:eastAsia="Arial Unicode MS" w:hAnsi="Arial Unicode MS"/>
-          <w:rtl w:val="0"/>
-        </w:rPr>
-        <w:t xml:space="preserve">เมื่อข้อมูลผ่านการตรวจสอบและบันทึกสำเร็จ ให้สร้างรายการแนวข้อสอบเพียงหนึ่งรายการต่อการส่งหนึ่งครั้ง</w:t>
-      </w:r>
-    </w:p>
-    <w:p>
-      <w:pPr>
-        <w:numPr>
-          <w:ilvl w:val="0"/>
-          <w:numId w:val="8"/>
-        </w:numPr>
-        <w:spacing w:after="0" w:afterAutospacing="0" w:before="0" w:beforeAutospacing="0" w:lineRule="auto"/>
-        <w:ind w:left="720" w:hanging="360"/>
-      </w:pPr>
-      <w:r>
-        <w:rPr>
-          <w:rFonts w:ascii="Arial Unicode MS" w:cs="Arial Unicode MS" w:eastAsia="Arial Unicode MS" w:hAnsi="Arial Unicode MS"/>
-          <w:rtl w:val="0"/>
-        </w:rPr>
-        <w:t xml:space="preserve">แสดงข้อความแจ้งสำเร็จและเปิดหน้ารายละเอียดของรายการที่เผยแพร่</w:t>
-      </w:r>
-    </w:p>
-    <w:p>
-      <w:pPr>
-        <w:numPr>
-          <w:ilvl w:val="0"/>
-          <w:numId w:val="8"/>
-        </w:numPr>
-        <w:spacing w:after="0" w:afterAutospacing="0" w:before="0" w:beforeAutospacing="0" w:lineRule="auto"/>
-        <w:ind w:left="720" w:hanging="360"/>
-      </w:pPr>
-      <w:r>
-        <w:rPr>
-          <w:rFonts w:ascii="Arial Unicode MS" w:cs="Arial Unicode MS" w:eastAsia="Arial Unicode MS" w:hAnsi="Arial Unicode MS"/>
-          <w:rtl w:val="0"/>
-        </w:rPr>
-        <w:t xml:space="preserve">รายการต้องปรากฏในหน้ารายวิชาและหน้ารายการของผู้เผยแพร่</w:t>
-      </w:r>
-    </w:p>
-    <w:p>
-      <w:pPr>
-        <w:numPr>
-          <w:ilvl w:val="0"/>
-          <w:numId w:val="8"/>
-        </w:numPr>
-        <w:spacing w:after="0" w:afterAutospacing="0" w:before="0" w:beforeAutospacing="0" w:lineRule="auto"/>
-        <w:ind w:left="720" w:hanging="360"/>
-      </w:pPr>
-      <w:r>
-        <w:rPr>
-          <w:rFonts w:ascii="Arial Unicode MS" w:cs="Arial Unicode MS" w:eastAsia="Arial Unicode MS" w:hAnsi="Arial Unicode MS"/>
-          <w:rtl w:val="0"/>
-        </w:rPr>
-        <w:t xml:space="preserve">นักศึกษาคนอื่นที่ Login สามารถอ่านรายการได้ทันทีโดยไม่ต้องรออนุมัติ</w:t>
-      </w:r>
-    </w:p>
-    <w:p>
-      <w:pPr>
-        <w:numPr>
-          <w:ilvl w:val="0"/>
-          <w:numId w:val="8"/>
-        </w:numPr>
-        <w:spacing w:after="0" w:afterAutospacing="0" w:before="0" w:beforeAutospacing="0" w:lineRule="auto"/>
-        <w:ind w:left="720" w:hanging="360"/>
-      </w:pPr>
-      <w:r>
-        <w:rPr>
-          <w:rFonts w:ascii="Arial Unicode MS" w:cs="Arial Unicode MS" w:eastAsia="Arial Unicode MS" w:hAnsi="Arial Unicode MS"/>
-          <w:rtl w:val="0"/>
-        </w:rPr>
-        <w:t xml:space="preserve">ข้อมูลต้องยังคงอยู่หลังโหลดหน้าใหม่</w:t>
-      </w:r>
-    </w:p>
-    <w:p>
-      <w:pPr>
-        <w:numPr>
-          <w:ilvl w:val="0"/>
-          <w:numId w:val="8"/>
-        </w:numPr>
-        <w:spacing w:after="240" w:before="0" w:beforeAutospacing="0" w:lineRule="auto"/>
-        <w:ind w:left="720" w:hanging="360"/>
-      </w:pPr>
-      <w:r>
-        <w:rPr>
-          <w:rFonts w:ascii="Arial Unicode MS" w:cs="Arial Unicode MS" w:eastAsia="Arial Unicode MS" w:hAnsi="Arial Unicode MS"/>
-          <w:rtl w:val="0"/>
-        </w:rPr>
-        <w:t xml:space="preserve">หากบันทึกล้มเหลว ต้องไม่แสดงข้อความว่าสำเร็จ และต้องไม่มีข้อมูลที่บันทึกค้างไว้บางส่วน</w:t>
-      </w:r>
-    </w:p>
-    <w:p>
-      <w:pPr>
-        <w:pStyle w:val="Heading2"/>
-        <w:keepNext w:val="0"/>
-        <w:keepLines w:val="0"/>
-        <w:spacing w:after="80" w:lineRule="auto"/>
-        <w:rPr>
-          <w:b w:val="1"/>
-          <w:bCs w:val="1"/>
-          <w:sz w:val="34"/>
-          <w:szCs w:val="34"/>
-        </w:rPr>
-      </w:pPr>
-      <w:bookmarkStart w:colFirst="0" w:colLast="0" w:name="_30laczme4o5b" w:id="9"/>
-      <w:bookmarkEnd w:id="9"/>
-      <w:r>
-        <w:rPr>
-          <w:rFonts w:ascii="Arial Unicode MS" w:cs="Arial Unicode MS" w:eastAsia="Arial Unicode MS" w:hAnsi="Arial Unicode MS"/>
-          <w:b w:val="1"/>
-          <w:bCs w:val="1"/>
-          <w:sz w:val="34"/>
-          <w:szCs w:val="34"/>
-          <w:rtl w:val="0"/>
-        </w:rPr>
-        <w:t xml:space="preserve">6. ผลลัพธ์ที่คาดหวัง</w:t>
-      </w:r>
-    </w:p>
-    <w:p>
-      <w:pPr>
-        <w:numPr>
-          <w:ilvl w:val="0"/>
-          <w:numId w:val="5"/>
-        </w:numPr>
-        <w:spacing w:after="0" w:afterAutospacing="0" w:before="240" w:lineRule="auto"/>
-        <w:ind w:left="720" w:hanging="360"/>
-      </w:pPr>
-      <w:r>
-        <w:rPr>
-          <w:rFonts w:ascii="Arial Unicode MS" w:cs="Arial Unicode MS" w:eastAsia="Arial Unicode MS" w:hAnsi="Arial Unicode MS"/>
-          <w:rtl w:val="0"/>
-        </w:rPr>
-        <w:t xml:space="preserve">ข้อมูลไม่ครบหรือไม่ถูกต้อง: แจ้งข้อผิดพลาดและไม่สร้างรายการ</w:t>
-      </w:r>
-    </w:p>
-    <w:p>
-      <w:pPr>
-        <w:numPr>
-          <w:ilvl w:val="0"/>
-          <w:numId w:val="5"/>
-        </w:numPr>
-        <w:spacing w:after="0" w:afterAutospacing="0" w:before="0" w:beforeAutospacing="0" w:lineRule="auto"/>
-        <w:ind w:left="720" w:hanging="360"/>
-      </w:pPr>
-      <w:r>
-        <w:rPr>
-          <w:rFonts w:ascii="Arial Unicode MS" w:cs="Arial Unicode MS" w:eastAsia="Arial Unicode MS" w:hAnsi="Arial Unicode MS"/>
-          <w:rtl w:val="0"/>
-        </w:rPr>
-        <w:t xml:space="preserve">ข้อมูลถูกต้องและบันทึกสำเร็จ: เผยแพร่รายการและเปิดอ่านได้ทันที</w:t>
-      </w:r>
-    </w:p>
-    <w:p>
-      <w:pPr>
-        <w:numPr>
-          <w:ilvl w:val="0"/>
-          <w:numId w:val="5"/>
-        </w:numPr>
-        <w:spacing w:after="0" w:afterAutospacing="0" w:before="0" w:beforeAutospacing="0" w:lineRule="auto"/>
-        <w:ind w:left="720" w:hanging="360"/>
-      </w:pPr>
-      <w:r>
-        <w:rPr>
-          <w:rFonts w:ascii="Arial Unicode MS" w:cs="Arial Unicode MS" w:eastAsia="Arial Unicode MS" w:hAnsi="Arial Unicode MS"/>
-          <w:rtl w:val="0"/>
-        </w:rPr>
-        <w:t xml:space="preserve">ผู้เผยแพร่และนักศึกษาคนอื่นที่ Login สามารถเปิดอ่านข้อมูลตามสิทธิ์ที่กำหนด</w:t>
-      </w:r>
-    </w:p>
-    <w:p>
-      <w:pPr>
-        <w:numPr>
-          <w:ilvl w:val="0"/>
-          <w:numId w:val="5"/>
-        </w:numPr>
-        <w:spacing w:after="0" w:afterAutospacing="0" w:before="0" w:beforeAutospacing="0" w:lineRule="auto"/>
-        <w:ind w:left="720" w:hanging="360"/>
-      </w:pPr>
-      <w:r>
-        <w:rPr>
-          <w:rFonts w:ascii="Arial Unicode MS" w:cs="Arial Unicode MS" w:eastAsia="Arial Unicode MS" w:hAnsi="Arial Unicode MS"/>
-          <w:rtl w:val="0"/>
-        </w:rPr>
-        <w:t xml:space="preserve">ข้อมูลเจ้าของรายการต้องตรงกับบัญชีผู้ใช้ที่ผ่านการยืนยันตัวตน</w:t>
-      </w:r>
-    </w:p>
-    <w:p>
-      <w:pPr>
-        <w:numPr>
-          <w:ilvl w:val="0"/>
-          <w:numId w:val="5"/>
-        </w:numPr>
-        <w:spacing w:after="240" w:before="0" w:beforeAutospacing="0" w:lineRule="auto"/>
-        <w:ind w:left="720" w:hanging="360"/>
-      </w:pPr>
-      <w:r>
-        <w:rPr>
-          <w:rFonts w:ascii="Arial Unicode MS" w:cs="Arial Unicode MS" w:eastAsia="Arial Unicode MS" w:hAnsi="Arial Unicode MS"/>
-          <w:rtl w:val="0"/>
-        </w:rPr>
         <w:t xml:space="preserve">เมื่อบันทึกล้มเหลว ระบบต้องไม่แสดงว่าการเผยแพร่สำเร็จ</w:t>
       </w:r>
     </w:p>
     <w:p>
       <w:pPr>
-        <w:pStyle w:val="Heading2"/>
-        <w:keepNext w:val="0"/>
-        <w:keepLines w:val="0"/>
-        <w:spacing w:after="80" w:lineRule="auto"/>
-        <w:rPr>
-          <w:b w:val="1"/>
-          <w:bCs w:val="1"/>
-          <w:sz w:val="34"/>
-          <w:szCs w:val="34"/>
-        </w:rPr>
-      </w:pPr>
-      <w:bookmarkStart w:colFirst="0" w:colLast="0" w:name="_nggsip89br5" w:id="10"/>
-      <w:bookmarkEnd w:id="10"/>
-      <w:r>
-        <w:rPr>
-          <w:rFonts w:ascii="Arial Unicode MS" w:cs="Arial Unicode MS" w:eastAsia="Arial Unicode MS" w:hAnsi="Arial Unicode MS"/>
-          <w:b w:val="1"/>
-          <w:bCs w:val="1"/>
-          <w:sz w:val="34"/>
-          <w:szCs w:val="34"/>
-          <w:rtl w:val="0"/>
-        </w:rPr>
-        <w:t xml:space="preserve">7. การทบทวนโดย Product Owner (PO Review)</w:t>
-      </w:r>
-    </w:p>
-    <w:p>
-      <w:pPr>
-        <w:numPr>
-          <w:ilvl w:val="0"/>
-          <w:numId w:val="2"/>
-        </w:numPr>
-        <w:spacing w:after="0" w:afterAutospacing="0" w:before="240" w:lineRule="auto"/>
-        <w:ind w:left="720" w:hanging="360"/>
-      </w:pPr>
-      <w:r>
-        <w:rPr>
-          <w:rFonts w:ascii="Arial Unicode MS" w:cs="Arial Unicode MS" w:eastAsia="Arial Unicode MS" w:hAnsi="Arial Unicode MS"/>
-          <w:rtl w:val="0"/>
-        </w:rPr>
-        <w:t xml:space="preserve">ชื่อ PO: [รอระบุชื่อผู้ทบทวน]</w:t>
-      </w:r>
-    </w:p>
-    <w:p>
-      <w:pPr>
-        <w:numPr>
-          <w:ilvl w:val="0"/>
-          <w:numId w:val="2"/>
-        </w:numPr>
-        <w:spacing w:after="0" w:afterAutospacing="0" w:before="0" w:beforeAutospacing="0" w:lineRule="auto"/>
-        <w:ind w:left="720" w:hanging="360"/>
-      </w:pPr>
-      <w:r>
-        <w:rPr>
-          <w:rFonts w:ascii="Arial Unicode MS" w:cs="Arial Unicode MS" w:eastAsia="Arial Unicode MS" w:hAnsi="Arial Unicode MS"/>
-          <w:rtl w:val="0"/>
-        </w:rPr>
-        <w:t xml:space="preserve">วันที่ทบทวน: [รอระบุวันที่ทบทวน]</w:t>
-      </w:r>
-    </w:p>
-    <w:p>
-      <w:pPr>
-        <w:numPr>
-          <w:ilvl w:val="0"/>
-          <w:numId w:val="2"/>
-        </w:numPr>
-        <w:spacing w:after="0" w:afterAutospacing="0" w:before="0" w:beforeAutospacing="0" w:lineRule="auto"/>
-        <w:ind w:left="720" w:hanging="360"/>
-      </w:pPr>
-      <w:r>
-        <w:rPr>
-          <w:rFonts w:ascii="Arial Unicode MS" w:cs="Arial Unicode MS" w:eastAsia="Arial Unicode MS" w:hAnsi="Arial Unicode MS"/>
-          <w:rtl w:val="0"/>
-        </w:rPr>
-        <w:t xml:space="preserve">สถานะ: รอการทบทวน</w:t>
-      </w:r>
-    </w:p>
-    <w:p>
-      <w:pPr>
-        <w:numPr>
-          <w:ilvl w:val="0"/>
-          <w:numId w:val="2"/>
-        </w:numPr>
-        <w:spacing w:after="0" w:afterAutospacing="0" w:before="0" w:beforeAutospacing="0" w:lineRule="auto"/>
-        <w:ind w:left="720" w:hanging="360"/>
-      </w:pPr>
-      <w:r>
-        <w:rPr>
-          <w:rFonts w:ascii="Arial Unicode MS" w:cs="Arial Unicode MS" w:eastAsia="Arial Unicode MS" w:hAnsi="Arial Unicode MS"/>
-          <w:rtl w:val="0"/>
-        </w:rPr>
-        <w:t xml:space="preserve">ข้อเสนอแนะ: [รอระบุข้อเสนอแนะ]</w:t>
-      </w:r>
-    </w:p>
-    <w:p>
-      <w:pPr>
-        <w:numPr>
-          <w:ilvl w:val="0"/>
-          <w:numId w:val="2"/>
-        </w:numPr>
-        <w:spacing w:after="240" w:before="0" w:beforeAutospacing="0" w:lineRule="auto"/>
-        <w:ind w:left="720" w:hanging="360"/>
-      </w:pPr>
-      <w:r>
-        <w:rPr>
-          <w:rFonts w:ascii="Arial Unicode MS" w:cs="Arial Unicode MS" w:eastAsia="Arial Unicode MS" w:hAnsi="Arial Unicode MS"/>
-          <w:rtl w:val="0"/>
-        </w:rPr>
-        <w:t xml:space="preserve">ผลการยืนยัน: รอการยืนยัน</w:t>
-      </w:r>
-    </w:p>
-    <w:p>
-      <w:pPr>
         <w:spacing w:after="240" w:before="240" w:lineRule="auto"/>
-        <w:rPr>
-          <w:b w:val="1"/>
-          <w:bCs w:val="1"/>
-        </w:rPr>
-      </w:pPr>
-      <w:r>
-        <w:rPr>
-          <w:rFonts w:ascii="Arial Unicode MS" w:cs="Arial Unicode MS" w:eastAsia="Arial Unicode MS" w:hAnsi="Arial Unicode MS"/>
-          <w:b w:val="1"/>
-          <w:bCs w:val="1"/>
-          <w:rtl w:val="0"/>
-        </w:rPr>
-        <w:t xml:space="preserve">ประเด็นที่ต้องให้ PO ยืนยัน</w:t>
-      </w:r>
-    </w:p>
-    <w:p>
-      <w:pPr>
-        <w:numPr>
-          <w:ilvl w:val="0"/>
-          <w:numId w:val="7"/>
-        </w:numPr>
-        <w:spacing w:after="0" w:afterAutospacing="0" w:before="240" w:lineRule="auto"/>
-        <w:ind w:left="720" w:hanging="360"/>
-      </w:pPr>
-      <w:r>
-        <w:rPr>
-          <w:rFonts w:ascii="Arial Unicode MS" w:cs="Arial Unicode MS" w:eastAsia="Arial Unicode MS" w:hAnsi="Arial Unicode MS"/>
-          <w:rtl w:val="0"/>
-        </w:rPr>
-        <w:t xml:space="preserve">รายการฟิลด์บัละผู้สอน</w:t>
-      </w:r>
-    </w:p>
-    <w:p>
-      <w:pPr>
-        <w:numPr>
-          <w:ilvl w:val="0"/>
-          <w:numId w:val="7"/>
-        </w:numPr>
-        <w:spacing w:after="0" w:afterAutospacing="0" w:before="0" w:beforeAutospacing="0" w:lineRule="auto"/>
-        <w:ind w:left="720" w:hanging="360"/>
-      </w:pPr>
-      <w:r>
-        <w:rPr>
-          <w:rFonts w:ascii="Arial Unicode MS" w:cs="Arial Unicode MS" w:eastAsia="Arial Unicode MS" w:hAnsi="Arial Unicode MS"/>
-          <w:rtl w:val="0"/>
-        </w:rPr>
-        <w:t xml:space="preserve">รูปแบบการเลือกจำนวนข้งคับและฟิลด์เสริม</w:t>
-      </w:r>
-    </w:p>
-    <w:p>
-      <w:pPr>
-        <w:numPr>
-          <w:ilvl w:val="0"/>
-          <w:numId w:val="7"/>
-        </w:numPr>
-        <w:spacing w:after="0" w:afterAutospacing="0" w:before="0" w:beforeAutospacing="0" w:lineRule="auto"/>
-        <w:ind w:left="720" w:hanging="360"/>
-      </w:pPr>
-      <w:r>
-        <w:rPr>
-          <w:rFonts w:ascii="Arial Unicode MS" w:cs="Arial Unicode MS" w:eastAsia="Arial Unicode MS" w:hAnsi="Arial Unicode MS"/>
-          <w:rtl w:val="0"/>
-        </w:rPr>
-        <w:t xml:space="preserve">ตัวเลือกปีการศึกษา รายวิชา แอสอบและตัวเลือกไม่ระบุ</w:t>
-      </w:r>
-    </w:p>
-    <w:p>
-      <w:pPr>
-        <w:numPr>
-          <w:ilvl w:val="0"/>
-          <w:numId w:val="7"/>
-        </w:numPr>
-        <w:spacing w:after="0" w:afterAutospacing="0" w:before="0" w:beforeAutospacing="0" w:lineRule="auto"/>
-        <w:ind w:left="720" w:hanging="360"/>
-      </w:pPr>
-      <w:r>
-        <w:rPr>
-          <w:rFonts w:ascii="Arial Unicode MS" w:cs="Arial Unicode MS" w:eastAsia="Arial Unicode MS" w:hAnsi="Arial Unicode MS"/>
-          <w:rtl w:val="0"/>
-        </w:rPr>
-        <w:t xml:space="preserve">รูปแบบข้อสอบที่ระบบจะรองรับ</w:t>
-      </w:r>
-    </w:p>
-    <w:p>
-      <w:pPr>
-        <w:numPr>
-          <w:ilvl w:val="0"/>
-          <w:numId w:val="7"/>
-        </w:numPr>
-        <w:spacing w:after="240" w:before="0" w:beforeAutospacing="0" w:lineRule="auto"/>
-        <w:ind w:left="720" w:hanging="360"/>
-      </w:pPr>
-      <w:r>
-        <w:rPr>
-          <w:rFonts w:ascii="Arial Unicode MS" w:cs="Arial Unicode MS" w:eastAsia="Arial Unicode MS" w:hAnsi="Arial Unicode MS"/>
-          <w:rtl w:val="0"/>
-        </w:rPr>
-        <w:t xml:space="preserve">กติกาการเผยแพร่ทันทีและการกำหนดเจ้าของรายการ</w:t>
-      </w:r>
-    </w:p>
-    <w:p>
-      <w:pPr>
+        <w:ind w:left="0" w:firstLine="0"/>
         <w:rPr/>
       </w:pPr>
       <w:r>
@@ -3463,8 +3035,8 @@
   <w:abstractNum w:abstractNumId="2">
     <w:lvl w:ilvl="0">
       <w:start w:val="1"/>
-      <w:numFmt w:val="bullet"/>
-      <w:lvlText w:val="●"/>
+      <w:numFmt w:val="decimal"/>
+      <w:lvlText w:val="%1."/>
       <w:lvlJc w:val="left"/>
       <w:pPr>
         <w:ind w:left="720" w:hanging="360"/>
@@ -3475,8 +3047,8 @@
     </w:lvl>
     <w:lvl w:ilvl="1">
       <w:start w:val="1"/>
-      <w:numFmt w:val="bullet"/>
-      <w:lvlText w:val="○"/>
+      <w:numFmt w:val="lowerLetter"/>
+      <w:lvlText w:val="%2."/>
       <w:lvlJc w:val="left"/>
       <w:pPr>
         <w:ind w:left="1440" w:hanging="360"/>
@@ -3487,8 +3059,8 @@
     </w:lvl>
     <w:lvl w:ilvl="2">
       <w:start w:val="1"/>
-      <w:numFmt w:val="bullet"/>
-      <w:lvlText w:val="■"/>
+      <w:numFmt w:val="lowerRoman"/>
+      <w:lvlText w:val="%3."/>
       <w:lvlJc w:val="left"/>
       <w:pPr>
         <w:ind w:left="2160" w:hanging="360"/>
@@ -3499,8 +3071,8 @@
     </w:lvl>
     <w:lvl w:ilvl="3">
       <w:start w:val="1"/>
-      <w:numFmt w:val="bullet"/>
-      <w:lvlText w:val="●"/>
+      <w:numFmt w:val="decimal"/>
+      <w:lvlText w:val="%4."/>
       <w:lvlJc w:val="left"/>
       <w:pPr>
         <w:ind w:left="2880" w:hanging="360"/>
@@ -3511,8 +3083,8 @@
     </w:lvl>
     <w:lvl w:ilvl="4">
       <w:start w:val="1"/>
-      <w:numFmt w:val="bullet"/>
-      <w:lvlText w:val="○"/>
+      <w:numFmt w:val="lowerLetter"/>
+      <w:lvlText w:val="%5."/>
       <w:lvlJc w:val="left"/>
       <w:pPr>
         <w:ind w:left="3600" w:hanging="360"/>
@@ -3523,8 +3095,8 @@
     </w:lvl>
     <w:lvl w:ilvl="5">
       <w:start w:val="1"/>
-      <w:numFmt w:val="bullet"/>
-      <w:lvlText w:val="■"/>
+      <w:numFmt w:val="lowerRoman"/>
+      <w:lvlText w:val="%6."/>
       <w:lvlJc w:val="left"/>
       <w:pPr>
         <w:ind w:left="4320" w:hanging="360"/>
@@ -3535,8 +3107,8 @@
     </w:lvl>
     <w:lvl w:ilvl="6">
       <w:start w:val="1"/>
-      <w:numFmt w:val="bullet"/>
-      <w:lvlText w:val="●"/>
+      <w:numFmt w:val="decimal"/>
+      <w:lvlText w:val="%7."/>
       <w:lvlJc w:val="left"/>
       <w:pPr>
         <w:ind w:left="5040" w:hanging="360"/>
@@ -3547,8 +3119,8 @@
     </w:lvl>
     <w:lvl w:ilvl="7">
       <w:start w:val="1"/>
-      <w:numFmt w:val="bullet"/>
-      <w:lvlText w:val="○"/>
+      <w:numFmt w:val="lowerLetter"/>
+      <w:lvlText w:val="%8."/>
       <w:lvlJc w:val="left"/>
       <w:pPr>
         <w:ind w:left="5760" w:hanging="360"/>
@@ -3559,8 +3131,8 @@
     </w:lvl>
     <w:lvl w:ilvl="8">
       <w:start w:val="1"/>
-      <w:numFmt w:val="bullet"/>
-      <w:lvlText w:val="■"/>
+      <w:numFmt w:val="lowerRoman"/>
+      <w:lvlText w:val="%9."/>
       <w:lvlJc w:val="left"/>
       <w:pPr>
         <w:ind w:left="6480" w:hanging="360"/>
@@ -3683,8 +3255,8 @@
   <w:abstractNum w:abstractNumId="4">
     <w:lvl w:ilvl="0">
       <w:start w:val="1"/>
-      <w:numFmt w:val="decimal"/>
-      <w:lvlText w:val="%1."/>
+      <w:numFmt w:val="bullet"/>
+      <w:lvlText w:val="●"/>
       <w:lvlJc w:val="left"/>
       <w:pPr>
         <w:ind w:left="720" w:hanging="360"/>
@@ -3695,8 +3267,8 @@
     </w:lvl>
     <w:lvl w:ilvl="1">
       <w:start w:val="1"/>
-      <w:numFmt w:val="lowerLetter"/>
-      <w:lvlText w:val="%2."/>
+      <w:numFmt w:val="bullet"/>
+      <w:lvlText w:val="○"/>
       <w:lvlJc w:val="left"/>
       <w:pPr>
         <w:ind w:left="1440" w:hanging="360"/>
@@ -3707,8 +3279,8 @@
     </w:lvl>
     <w:lvl w:ilvl="2">
       <w:start w:val="1"/>
-      <w:numFmt w:val="lowerRoman"/>
-      <w:lvlText w:val="%3."/>
+      <w:numFmt w:val="bullet"/>
+      <w:lvlText w:val="■"/>
       <w:lvlJc w:val="left"/>
       <w:pPr>
         <w:ind w:left="2160" w:hanging="360"/>
@@ -3719,8 +3291,8 @@
     </w:lvl>
     <w:lvl w:ilvl="3">
       <w:start w:val="1"/>
-      <w:numFmt w:val="decimal"/>
-      <w:lvlText w:val="%4."/>
+      <w:numFmt w:val="bullet"/>
+      <w:lvlText w:val="●"/>
       <w:lvlJc w:val="left"/>
       <w:pPr>
         <w:ind w:left="2880" w:hanging="360"/>
@@ -3731,8 +3303,8 @@
     </w:lvl>
     <w:lvl w:ilvl="4">
       <w:start w:val="1"/>
-      <w:numFmt w:val="lowerLetter"/>
-      <w:lvlText w:val="%5."/>
+      <w:numFmt w:val="bullet"/>
+      <w:lvlText w:val="○"/>
       <w:lvlJc w:val="left"/>
       <w:pPr>
         <w:ind w:left="3600" w:hanging="360"/>
@@ -3743,8 +3315,8 @@
     </w:lvl>
     <w:lvl w:ilvl="5">
       <w:start w:val="1"/>
-      <w:numFmt w:val="lowerRoman"/>
-      <w:lvlText w:val="%6."/>
+      <w:numFmt w:val="bullet"/>
+      <w:lvlText w:val="■"/>
       <w:lvlJc w:val="left"/>
       <w:pPr>
         <w:ind w:left="4320" w:hanging="360"/>
@@ -3755,8 +3327,8 @@
     </w:lvl>
     <w:lvl w:ilvl="6">
       <w:start w:val="1"/>
-      <w:numFmt w:val="decimal"/>
-      <w:lvlText w:val="%7."/>
+      <w:numFmt w:val="bullet"/>
+      <w:lvlText w:val="●"/>
       <w:lvlJc w:val="left"/>
       <w:pPr>
         <w:ind w:left="5040" w:hanging="360"/>
@@ -3767,8 +3339,8 @@
     </w:lvl>
     <w:lvl w:ilvl="7">
       <w:start w:val="1"/>
-      <w:numFmt w:val="lowerLetter"/>
-      <w:lvlText w:val="%8."/>
+      <w:numFmt w:val="bullet"/>
+      <w:lvlText w:val="○"/>
       <w:lvlJc w:val="left"/>
       <w:pPr>
         <w:ind w:left="5760" w:hanging="360"/>
@@ -3779,8 +3351,8 @@
     </w:lvl>
     <w:lvl w:ilvl="8">
       <w:start w:val="1"/>
-      <w:numFmt w:val="lowerRoman"/>
-      <w:lvlText w:val="%9."/>
+      <w:numFmt w:val="bullet"/>
+      <w:lvlText w:val="■"/>
       <w:lvlJc w:val="left"/>
       <w:pPr>
         <w:ind w:left="6480" w:hanging="360"/>
@@ -3793,8 +3365,8 @@
   <w:abstractNum w:abstractNumId="5">
     <w:lvl w:ilvl="0">
       <w:start w:val="1"/>
-      <w:numFmt w:val="bullet"/>
-      <w:lvlText w:val="●"/>
+      <w:numFmt w:val="decimal"/>
+      <w:lvlText w:val="%1."/>
       <w:lvlJc w:val="left"/>
       <w:pPr>
         <w:ind w:left="720" w:hanging="360"/>
@@ -3805,8 +3377,8 @@
     </w:lvl>
     <w:lvl w:ilvl="1">
       <w:start w:val="1"/>
-      <w:numFmt w:val="bullet"/>
-      <w:lvlText w:val="○"/>
+      <w:numFmt w:val="lowerLetter"/>
+      <w:lvlText w:val="%2."/>
       <w:lvlJc w:val="left"/>
       <w:pPr>
         <w:ind w:left="1440" w:hanging="360"/>
@@ -3817,8 +3389,8 @@
     </w:lvl>
     <w:lvl w:ilvl="2">
       <w:start w:val="1"/>
-      <w:numFmt w:val="bullet"/>
-      <w:lvlText w:val="■"/>
+      <w:numFmt w:val="lowerRoman"/>
+      <w:lvlText w:val="%3."/>
       <w:lvlJc w:val="left"/>
       <w:pPr>
         <w:ind w:left="2160" w:hanging="360"/>
@@ -3829,8 +3401,8 @@
     </w:lvl>
     <w:lvl w:ilvl="3">
       <w:start w:val="1"/>
-      <w:numFmt w:val="bullet"/>
-      <w:lvlText w:val="●"/>
+      <w:numFmt w:val="decimal"/>
+      <w:lvlText w:val="%4."/>
       <w:lvlJc w:val="left"/>
       <w:pPr>
         <w:ind w:left="2880" w:hanging="360"/>
@@ -3841,8 +3413,8 @@
     </w:lvl>
     <w:lvl w:ilvl="4">
       <w:start w:val="1"/>
-      <w:numFmt w:val="bullet"/>
-      <w:lvlText w:val="○"/>
+      <w:numFmt w:val="lowerLetter"/>
+      <w:lvlText w:val="%5."/>
       <w:lvlJc w:val="left"/>
       <w:pPr>
         <w:ind w:left="3600" w:hanging="360"/>
@@ -3853,8 +3425,8 @@
     </w:lvl>
     <w:lvl w:ilvl="5">
       <w:start w:val="1"/>
-      <w:numFmt w:val="bullet"/>
-      <w:lvlText w:val="■"/>
+      <w:numFmt w:val="lowerRoman"/>
+      <w:lvlText w:val="%6."/>
       <w:lvlJc w:val="left"/>
       <w:pPr>
         <w:ind w:left="4320" w:hanging="360"/>
@@ -3865,8 +3437,8 @@
     </w:lvl>
     <w:lvl w:ilvl="6">
       <w:start w:val="1"/>
-      <w:numFmt w:val="bullet"/>
-      <w:lvlText w:val="●"/>
+      <w:numFmt w:val="decimal"/>
+      <w:lvlText w:val="%7."/>
       <w:lvlJc w:val="left"/>
       <w:pPr>
         <w:ind w:left="5040" w:hanging="360"/>
@@ -3877,8 +3449,8 @@
     </w:lvl>
     <w:lvl w:ilvl="7">
       <w:start w:val="1"/>
-      <w:numFmt w:val="bullet"/>
-      <w:lvlText w:val="○"/>
+      <w:numFmt w:val="lowerLetter"/>
+      <w:lvlText w:val="%8."/>
       <w:lvlJc w:val="left"/>
       <w:pPr>
         <w:ind w:left="5760" w:hanging="360"/>
@@ -3889,8 +3461,8 @@
     </w:lvl>
     <w:lvl w:ilvl="8">
       <w:start w:val="1"/>
-      <w:numFmt w:val="bullet"/>
-      <w:lvlText w:val="■"/>
+      <w:numFmt w:val="lowerRoman"/>
+      <w:lvlText w:val="%9."/>
       <w:lvlJc w:val="left"/>
       <w:pPr>
         <w:ind w:left="6480" w:hanging="360"/>
@@ -3901,226 +3473,6 @@
     </w:lvl>
   </w:abstractNum>
   <w:abstractNum w:abstractNumId="6">
-    <w:lvl w:ilvl="0">
-      <w:start w:val="1"/>
-      <w:numFmt w:val="decimal"/>
-      <w:lvlText w:val="%1."/>
-      <w:lvlJc w:val="left"/>
-      <w:pPr>
-        <w:ind w:left="720" w:hanging="360"/>
-      </w:pPr>
-      <w:rPr>
-        <w:u w:val="none"/>
-      </w:rPr>
-    </w:lvl>
-    <w:lvl w:ilvl="1">
-      <w:start w:val="1"/>
-      <w:numFmt w:val="lowerLetter"/>
-      <w:lvlText w:val="%2."/>
-      <w:lvlJc w:val="left"/>
-      <w:pPr>
-        <w:ind w:left="1440" w:hanging="360"/>
-      </w:pPr>
-      <w:rPr>
-        <w:u w:val="none"/>
-      </w:rPr>
-    </w:lvl>
-    <w:lvl w:ilvl="2">
-      <w:start w:val="1"/>
-      <w:numFmt w:val="lowerRoman"/>
-      <w:lvlText w:val="%3."/>
-      <w:lvlJc w:val="left"/>
-      <w:pPr>
-        <w:ind w:left="2160" w:hanging="360"/>
-      </w:pPr>
-      <w:rPr>
-        <w:u w:val="none"/>
-      </w:rPr>
-    </w:lvl>
-    <w:lvl w:ilvl="3">
-      <w:start w:val="1"/>
-      <w:numFmt w:val="decimal"/>
-      <w:lvlText w:val="%4."/>
-      <w:lvlJc w:val="left"/>
-      <w:pPr>
-        <w:ind w:left="2880" w:hanging="360"/>
-      </w:pPr>
-      <w:rPr>
-        <w:u w:val="none"/>
-      </w:rPr>
-    </w:lvl>
-    <w:lvl w:ilvl="4">
-      <w:start w:val="1"/>
-      <w:numFmt w:val="lowerLetter"/>
-      <w:lvlText w:val="%5."/>
-      <w:lvlJc w:val="left"/>
-      <w:pPr>
-        <w:ind w:left="3600" w:hanging="360"/>
-      </w:pPr>
-      <w:rPr>
-        <w:u w:val="none"/>
-      </w:rPr>
-    </w:lvl>
-    <w:lvl w:ilvl="5">
-      <w:start w:val="1"/>
-      <w:numFmt w:val="lowerRoman"/>
-      <w:lvlText w:val="%6."/>
-      <w:lvlJc w:val="left"/>
-      <w:pPr>
-        <w:ind w:left="4320" w:hanging="360"/>
-      </w:pPr>
-      <w:rPr>
-        <w:u w:val="none"/>
-      </w:rPr>
-    </w:lvl>
-    <w:lvl w:ilvl="6">
-      <w:start w:val="1"/>
-      <w:numFmt w:val="decimal"/>
-      <w:lvlText w:val="%7."/>
-      <w:lvlJc w:val="left"/>
-      <w:pPr>
-        <w:ind w:left="5040" w:hanging="360"/>
-      </w:pPr>
-      <w:rPr>
-        <w:u w:val="none"/>
-      </w:rPr>
-    </w:lvl>
-    <w:lvl w:ilvl="7">
-      <w:start w:val="1"/>
-      <w:numFmt w:val="lowerLetter"/>
-      <w:lvlText w:val="%8."/>
-      <w:lvlJc w:val="left"/>
-      <w:pPr>
-        <w:ind w:left="5760" w:hanging="360"/>
-      </w:pPr>
-      <w:rPr>
-        <w:u w:val="none"/>
-      </w:rPr>
-    </w:lvl>
-    <w:lvl w:ilvl="8">
-      <w:start w:val="1"/>
-      <w:numFmt w:val="lowerRoman"/>
-      <w:lvlText w:val="%9."/>
-      <w:lvlJc w:val="left"/>
-      <w:pPr>
-        <w:ind w:left="6480" w:hanging="360"/>
-      </w:pPr>
-      <w:rPr>
-        <w:u w:val="none"/>
-      </w:rPr>
-    </w:lvl>
-  </w:abstractNum>
-  <w:abstractNum w:abstractNumId="7">
-    <w:lvl w:ilvl="0">
-      <w:start w:val="1"/>
-      <w:numFmt w:val="decimal"/>
-      <w:lvlText w:val="%1."/>
-      <w:lvlJc w:val="left"/>
-      <w:pPr>
-        <w:ind w:left="720" w:hanging="360"/>
-      </w:pPr>
-      <w:rPr>
-        <w:u w:val="none"/>
-      </w:rPr>
-    </w:lvl>
-    <w:lvl w:ilvl="1">
-      <w:start w:val="1"/>
-      <w:numFmt w:val="lowerLetter"/>
-      <w:lvlText w:val="%2."/>
-      <w:lvlJc w:val="left"/>
-      <w:pPr>
-        <w:ind w:left="1440" w:hanging="360"/>
-      </w:pPr>
-      <w:rPr>
-        <w:u w:val="none"/>
-      </w:rPr>
-    </w:lvl>
-    <w:lvl w:ilvl="2">
-      <w:start w:val="1"/>
-      <w:numFmt w:val="lowerRoman"/>
-      <w:lvlText w:val="%3."/>
-      <w:lvlJc w:val="left"/>
-      <w:pPr>
-        <w:ind w:left="2160" w:hanging="360"/>
-      </w:pPr>
-      <w:rPr>
-        <w:u w:val="none"/>
-      </w:rPr>
-    </w:lvl>
-    <w:lvl w:ilvl="3">
-      <w:start w:val="1"/>
-      <w:numFmt w:val="decimal"/>
-      <w:lvlText w:val="%4."/>
-      <w:lvlJc w:val="left"/>
-      <w:pPr>
-        <w:ind w:left="2880" w:hanging="360"/>
-      </w:pPr>
-      <w:rPr>
-        <w:u w:val="none"/>
-      </w:rPr>
-    </w:lvl>
-    <w:lvl w:ilvl="4">
-      <w:start w:val="1"/>
-      <w:numFmt w:val="lowerLetter"/>
-      <w:lvlText w:val="%5."/>
-      <w:lvlJc w:val="left"/>
-      <w:pPr>
-        <w:ind w:left="3600" w:hanging="360"/>
-      </w:pPr>
-      <w:rPr>
-        <w:u w:val="none"/>
-      </w:rPr>
-    </w:lvl>
-    <w:lvl w:ilvl="5">
-      <w:start w:val="1"/>
-      <w:numFmt w:val="lowerRoman"/>
-      <w:lvlText w:val="%6."/>
-      <w:lvlJc w:val="left"/>
-      <w:pPr>
-        <w:ind w:left="4320" w:hanging="360"/>
-      </w:pPr>
-      <w:rPr>
-        <w:u w:val="none"/>
-      </w:rPr>
-    </w:lvl>
-    <w:lvl w:ilvl="6">
-      <w:start w:val="1"/>
-      <w:numFmt w:val="decimal"/>
-      <w:lvlText w:val="%7."/>
-      <w:lvlJc w:val="left"/>
-      <w:pPr>
-        <w:ind w:left="5040" w:hanging="360"/>
-      </w:pPr>
-      <w:rPr>
-        <w:u w:val="none"/>
-      </w:rPr>
-    </w:lvl>
-    <w:lvl w:ilvl="7">
-      <w:start w:val="1"/>
-      <w:numFmt w:val="lowerLetter"/>
-      <w:lvlText w:val="%8."/>
-      <w:lvlJc w:val="left"/>
-      <w:pPr>
-        <w:ind w:left="5760" w:hanging="360"/>
-      </w:pPr>
-      <w:rPr>
-        <w:u w:val="none"/>
-      </w:rPr>
-    </w:lvl>
-    <w:lvl w:ilvl="8">
-      <w:start w:val="1"/>
-      <w:numFmt w:val="lowerRoman"/>
-      <w:lvlText w:val="%9."/>
-      <w:lvlJc w:val="left"/>
-      <w:pPr>
-        <w:ind w:left="6480" w:hanging="360"/>
-      </w:pPr>
-      <w:rPr>
-        <w:u w:val="none"/>
-      </w:rPr>
-    </w:lvl>
-  </w:abstractNum>
-  <w:abstractNum w:abstractNumId="8">
     <w:lvl w:ilvl="0">
       <w:start w:val="1"/>
       <w:numFmt w:val="decimal"/>
@@ -4247,12 +3599,6 @@
   </w:num>
   <w:num w:numId="6">
     <w:abstractNumId w:val="6"/>
-  </w:num>
-  <w:num w:numId="7">
-    <w:abstractNumId w:val="7"/>
-  </w:num>
-  <w:num w:numId="8">
-    <w:abstractNumId w:val="8"/>
   </w:num>
 </w:numbering>
 </file>

</xml_diff>